<commit_message>
docs: Added documentation of project
</commit_message>
<xml_diff>
--- a/docs/LinkedIn Clone Document.docx
+++ b/docs/LinkedIn Clone Document.docx
@@ -34,21 +34,7 @@
           <w:b/>
           <w:bCs/>
         </w:rPr>
-        <w:t>HTML (</w:t>
-      </w:r>
-      <w:r>
-        <w:rPr>
-          <w:b/>
-          <w:bCs/>
-        </w:rPr>
-        <w:t>Hypertext</w:t>
-      </w:r>
-      <w:r>
-        <w:rPr>
-          <w:b/>
-          <w:bCs/>
-        </w:rPr>
-        <w:t xml:space="preserve"> Markup Language)</w:t>
+        <w:t>HTML (Hypertext Markup Language)</w:t>
       </w:r>
     </w:p>
     <w:p>
@@ -544,22 +530,26 @@
     <w:p>
       <w:r>
         <w:pict w14:anchorId="0ABE4DEB">
-          <v:rect id="_x0000_i1077" style="width:0;height:1.5pt" o:hralign="center" o:hrstd="t" o:hr="t" fillcolor="#a0a0a0" stroked="f"/>
+          <v:rect id="_x0000_i1025" style="width:0;height:1.5pt" o:hralign="center" o:hrstd="t" o:hr="t" fillcolor="#a0a0a0" stroked="f"/>
         </w:pict>
       </w:r>
     </w:p>
     <w:p>
-      <w:pPr>
+      <w:r>
         <w:rPr>
           <w:vanish/>
         </w:rPr>
-      </w:pPr>
-      <w:r>
+        <w:t>Top of Form</w:t>
+      </w:r>
+    </w:p>
+    <w:p/>
+    <w:p/>
+    <w:p>
+      <w:pPr>
         <w:rPr>
           <w:vanish/>
         </w:rPr>
-        <w:t>Top of Form</w:t>
-      </w:r>
+      </w:pPr>
     </w:p>
     <w:p/>
     <w:p>
@@ -1359,6 +1349,7 @@
   <w:style w:type="character" w:default="1" w:styleId="DefaultParagraphFont">
     <w:name w:val="Default Paragraph Font"/>
     <w:uiPriority w:val="1"/>
+    <w:semiHidden/>
     <w:unhideWhenUsed/>
   </w:style>
   <w:style w:type="table" w:default="1" w:styleId="TableNormal">

</xml_diff>